<commit_message>
Resultados finales con hash real, artículo, data y README
</commit_message>
<xml_diff>
--- a/docs/articulo.docx
+++ b/docs/articulo.docx
@@ -196,7 +196,7 @@
           <w:sz w:val="22"/>
           <w:szCs w:val="22"/>
         </w:rPr>
-        <w:t xml:space="preserve"> inserción creció de forma cuadrática (pendiente log-log ≈ 2.00), salvo en entradas ascendentes (≈ 0.91), donde fue 13 veces más rápida que quicksort (0.0858 ms frente a 1.10 ms con n = 100 000). Quicksort creció cerca de n log n y ordenó 100 000 enteros aleatorios en 4.29 ms frente a 1 645 ms de inserción, pero con 15 valores únicos subió a 221 ms, con unos 6 807 niveles de recursión. Inserción fue estable y quicksort no.</w:t>
+        <w:t xml:space="preserve"> inserción creció de forma cuadrática (pendiente log-log entre 1.89 y 1.96), salvo en entradas ascendentes (≈ 0.98), donde fue 10 veces más rápida que quicksort (0.141 ms frente a 1.41 ms con n = 100 000). Quicksort creció cerca de n log n y ordenó 100 000 enteros aleatorios en 6.19 ms frente a 2 460 ms de inserción, pero con 15 valores únicos subió a 319 ms, con unos 6 807 niveles de recursión. Inserción fue estable y quicksort no.</w:t>
       </w:r>
     </w:p>
     <w:p>
@@ -339,7 +339,7 @@
           <w:szCs w:val="22"/>
           <w:lang w:val="en-US"/>
         </w:rPr>
-        <w:t xml:space="preserve"> insertion sort grew quadratically (log-log slope ≈ 2.00), except on ascending inputs (≈ 0.91), where it was 13 times faster than quicksort (0.0858 ms vs. 1.10 ms for n = 100,000). Quicksort grew close to n log n and sorted 100,000 random integers in 4.29 ms vs. 1 645 ms for insertion sort, but with 15 distinct values it rose to 221 ms, with about 6 807 recursion levels. Insertion sort was stable and quicksort was not.</w:t>
+        <w:t xml:space="preserve"> insertion sort grew quadratically (log-log slope between 1.89 and 1.96), except on ascending inputs (≈ 0.98), where it was 10 times faster than quicksort (0.141 ms vs. 1.41 ms for n = 100,000). Quicksort grew close to n log n and sorted 100,000 random integers in 6.19 ms vs. 2 460 ms for insertion sort, but with 15 distinct values it rose to 319 ms, with about 6 807 recursion levels. Insertion sort was stable and quicksort was not.</w:t>
       </w:r>
     </w:p>
     <w:p>
@@ -1128,7 +1128,7 @@
         <w:t xml:space="preserve">Para cada combinación (algoritmo, patrón, n) se calculó la media, la mediana, la desviación estándar muestral, el mínimo y el máximo del tiempo. Para contrastar con la complejidad teórica se estimó la pendiente de la recta log-log del tiempo medio entre n = 1 000 y n = 100 000: una pendiente cercana a 2 indica crecimiento cuadrático y una cercana a 1.1 crecimiento tipo n log n en este rango (valor teórico: 1.11). El análisis es descriptivo, sin pruebas de hipótesis. El </w:t>
       </w:r>
       <w:r>
-        <w:t>código, los datos crudos y las gráficas están en el repositorio público del proyecto (versión medida: commit [hash del commit final]).</w:t>
+        <w:t>código, los datos crudos y las gráficas están en el repositorio público del proyecto (versión medida: commit 184ad89).</w:t>
       </w:r>
     </w:p>
     <w:p>
@@ -1147,7 +1147,7 @@
         <w:jc w:val="both"/>
       </w:pPr>
       <w:r>
-        <w:t>La Tabla 2 y la Figura 1 muestran el tiempo medio según n. En inserción el tiempo medio con n = 100 000 fue de 1 645.0 ms en entradas aleatorias, 3 335.4 ms en descendentes y 0.0858 ms en ascendentes. En quicksort fue de 4.29, 1.41 y 1.10 ms, respectivamente. Con duplicados, inserción tardó 1 573.4 ms y quicksort 220.9 ms.</w:t>
+        <w:t>La Tabla 2 y la Figura 1 muestran el tiempo medio según n. En inserción el tiempo medio con n = 100 000 fue de 2 459.9 ms en entradas aleatorias, 4 104.0 ms en descendentes y 0.141 ms en ascendentes. En quicksort fue de 6.19, 1.56 y 1.41 ms, respectivamente. Con duplicados, inserción tardó 2 212.9 ms y quicksort 319.1 ms.</w:t>
       </w:r>
     </w:p>
     <w:p>
@@ -1392,7 +1392,7 @@
                 <w:sz w:val="22"/>
                 <w:szCs w:val="22"/>
               </w:rPr>
-              <w:t>0.168 ± 0.0149</w:t>
+              <w:t>0.320 ± 0.125</w:t>
             </w:r>
           </w:p>
         </w:tc>
@@ -1412,7 +1412,7 @@
                 <w:sz w:val="22"/>
                 <w:szCs w:val="22"/>
               </w:rPr>
-              <w:t>16.1 ± 0.524</w:t>
+              <w:t>26.6 ± 1.72</w:t>
             </w:r>
           </w:p>
         </w:tc>
@@ -1432,7 +1432,7 @@
                 <w:sz w:val="22"/>
                 <w:szCs w:val="22"/>
               </w:rPr>
-              <w:t>1 645.0 ± 39.9</w:t>
+              <w:t>2 459.9 ± 622.7</w:t>
             </w:r>
           </w:p>
         </w:tc>
@@ -1489,7 +1489,7 @@
                 <w:sz w:val="22"/>
                 <w:szCs w:val="22"/>
               </w:rPr>
-              <w:t>0.0013 ± 0.0000</w:t>
+              <w:t>0.0016 ± 0.0002</w:t>
             </w:r>
           </w:p>
         </w:tc>
@@ -1509,7 +1509,7 @@
                 <w:sz w:val="22"/>
                 <w:szCs w:val="22"/>
               </w:rPr>
-              <w:t>0.0091 ± 0.0016</w:t>
+              <w:t>0.0136 ± 0.0024</w:t>
             </w:r>
           </w:p>
         </w:tc>
@@ -1529,7 +1529,7 @@
                 <w:sz w:val="22"/>
                 <w:szCs w:val="22"/>
               </w:rPr>
-              <w:t>0.0858 ± 0.0020</w:t>
+              <w:t>0.141 ± 0.112</w:t>
             </w:r>
           </w:p>
         </w:tc>
@@ -1586,7 +1586,7 @@
                 <w:sz w:val="22"/>
                 <w:szCs w:val="22"/>
               </w:rPr>
-              <w:t>0.338 ± 0.0532</w:t>
+              <w:t>0.597 ± 0.120</w:t>
             </w:r>
           </w:p>
         </w:tc>
@@ -1606,7 +1606,7 @@
                 <w:sz w:val="22"/>
                 <w:szCs w:val="22"/>
               </w:rPr>
-              <w:t>32.3 ± 0.911</w:t>
+              <w:t>44.5 ± 5.10</w:t>
             </w:r>
           </w:p>
         </w:tc>
@@ -1626,7 +1626,7 @@
                 <w:sz w:val="22"/>
                 <w:szCs w:val="22"/>
               </w:rPr>
-              <w:t>3 335.4 ± 63.0</w:t>
+              <w:t>4 104.0 ± 213.9</w:t>
             </w:r>
           </w:p>
         </w:tc>
@@ -1683,7 +1683,7 @@
                 <w:sz w:val="22"/>
                 <w:szCs w:val="22"/>
               </w:rPr>
-              <w:t>0.0111 ± 0.0011</w:t>
+              <w:t>0.0213 ± 0.0044</w:t>
             </w:r>
           </w:p>
         </w:tc>
@@ -1703,7 +1703,7 @@
                 <w:sz w:val="22"/>
                 <w:szCs w:val="22"/>
               </w:rPr>
-              <w:t>1.04 ± 0.0435</w:t>
+              <w:t>1.34 ± 0.253</w:t>
             </w:r>
           </w:p>
         </w:tc>
@@ -1723,7 +1723,7 @@
                 <w:sz w:val="22"/>
                 <w:szCs w:val="22"/>
               </w:rPr>
-              <w:t>108.6 ± 5.95</w:t>
+              <w:t>127.8 ± 3.56</w:t>
             </w:r>
           </w:p>
         </w:tc>
@@ -1780,7 +1780,7 @@
                 <w:sz w:val="22"/>
                 <w:szCs w:val="22"/>
               </w:rPr>
-              <w:t>0.152 ± 0.0079</w:t>
+              <w:t>0.268 ± 0.0246</w:t>
             </w:r>
           </w:p>
         </w:tc>
@@ -1800,7 +1800,7 @@
                 <w:sz w:val="22"/>
                 <w:szCs w:val="22"/>
               </w:rPr>
-              <w:t>15.0 ± 0.459</w:t>
+              <w:t>19.2 ± 1.28</w:t>
             </w:r>
           </w:p>
         </w:tc>
@@ -1820,7 +1820,7 @@
                 <w:sz w:val="22"/>
                 <w:szCs w:val="22"/>
               </w:rPr>
-              <w:t>1 573.4 ± 46.1</w:t>
+              <w:t>2 212.9 ± 550.0</w:t>
             </w:r>
           </w:p>
         </w:tc>
@@ -1884,7 +1884,7 @@
                 <w:sz w:val="22"/>
                 <w:szCs w:val="22"/>
               </w:rPr>
-              <w:t>0.0294 ± 0.0037</w:t>
+              <w:t>0.0559 ± 0.0358</w:t>
             </w:r>
           </w:p>
         </w:tc>
@@ -1904,7 +1904,7 @@
                 <w:sz w:val="22"/>
                 <w:szCs w:val="22"/>
               </w:rPr>
-              <w:t>0.352 ± 0.0122</w:t>
+              <w:t>0.568 ± 0.0362</w:t>
             </w:r>
           </w:p>
         </w:tc>
@@ -1924,7 +1924,7 @@
                 <w:sz w:val="22"/>
                 <w:szCs w:val="22"/>
               </w:rPr>
-              <w:t>4.29 ± 0.0886</w:t>
+              <w:t>6.19 ± 1.53</w:t>
             </w:r>
           </w:p>
         </w:tc>
@@ -1981,7 +1981,7 @@
                 <w:sz w:val="22"/>
                 <w:szCs w:val="22"/>
               </w:rPr>
-              <w:t>0.0097 ± 0.0015</w:t>
+              <w:t>0.0125 ± 0.0109</w:t>
             </w:r>
           </w:p>
         </w:tc>
@@ -2001,7 +2001,7 @@
                 <w:sz w:val="22"/>
                 <w:szCs w:val="22"/>
               </w:rPr>
-              <w:t>0.0873 ± 0.0139</w:t>
+              <w:t>0.134 ± 0.0254</w:t>
             </w:r>
           </w:p>
         </w:tc>
@@ -2021,7 +2021,7 @@
                 <w:sz w:val="22"/>
                 <w:szCs w:val="22"/>
               </w:rPr>
-              <w:t>1.10 ± 0.265</w:t>
+              <w:t>1.41 ± 0.435</w:t>
             </w:r>
           </w:p>
         </w:tc>
@@ -2078,7 +2078,7 @@
                 <w:sz w:val="22"/>
                 <w:szCs w:val="22"/>
               </w:rPr>
-              <w:t>0.0098 ± 0.0079</w:t>
+              <w:t>0.0158 ± 0.0060</w:t>
             </w:r>
           </w:p>
         </w:tc>
@@ -2098,7 +2098,7 @@
                 <w:sz w:val="22"/>
                 <w:szCs w:val="22"/>
               </w:rPr>
-              <w:t>0.109 ± 0.0073</w:t>
+              <w:t>0.157 ± 0.0272</w:t>
             </w:r>
           </w:p>
         </w:tc>
@@ -2118,7 +2118,7 @@
                 <w:sz w:val="22"/>
                 <w:szCs w:val="22"/>
               </w:rPr>
-              <w:t>1.41 ± 0.383</w:t>
+              <w:t>1.56 ± 0.121</w:t>
             </w:r>
           </w:p>
         </w:tc>
@@ -2175,7 +2175,7 @@
                 <w:sz w:val="22"/>
                 <w:szCs w:val="22"/>
               </w:rPr>
-              <w:t>0.0125 ± 0.0012</w:t>
+              <w:t>0.0233 ± 0.0033</w:t>
             </w:r>
           </w:p>
         </w:tc>
@@ -2195,7 +2195,7 @@
                 <w:sz w:val="22"/>
                 <w:szCs w:val="22"/>
               </w:rPr>
-              <w:t>0.173 ± 0.0029</w:t>
+              <w:t>0.226 ± 0.0586</w:t>
             </w:r>
           </w:p>
         </w:tc>
@@ -2215,7 +2215,7 @@
                 <w:sz w:val="22"/>
                 <w:szCs w:val="22"/>
               </w:rPr>
-              <w:t>2.23 ± 0.327</w:t>
+              <w:t>2.55 ± 0.0840</w:t>
             </w:r>
           </w:p>
         </w:tc>
@@ -2281,7 +2281,7 @@
                 <w:sz w:val="22"/>
                 <w:szCs w:val="22"/>
               </w:rPr>
-              <w:t>0.0366 ± 0.0021</w:t>
+              <w:t>0.0652 ± 0.0081</w:t>
             </w:r>
           </w:p>
         </w:tc>
@@ -2304,7 +2304,7 @@
                 <w:sz w:val="22"/>
                 <w:szCs w:val="22"/>
               </w:rPr>
-              <w:t>2.30 ± 0.0297</w:t>
+              <w:t>3.08 ± 0.465</w:t>
             </w:r>
           </w:p>
         </w:tc>
@@ -2327,7 +2327,7 @@
                 <w:sz w:val="22"/>
                 <w:szCs w:val="22"/>
               </w:rPr>
-              <w:t>220.9 ± 7.01</w:t>
+              <w:t>319.1 ± 83.2</w:t>
             </w:r>
           </w:p>
         </w:tc>
@@ -2458,10 +2458,10 @@
         <w:jc w:val="both"/>
       </w:pPr>
       <w:r>
-        <w:t xml:space="preserve">La Tabla 3 detalla la estadística descriptiva con n = 100 000. La variabilidad relativa fue baja en inserción (desviación estándar de entre 1.9 % y 5.5 % de la media) y mayor en quicksort, </w:t>
-      </w:r>
-      <w:r>
-        <w:t>sobre todo en tiempos de pocos milisegundos (hasta 27 % en entradas descendentes y 24 % en ascendentes), como muestra la Figura 2.</w:t>
+        <w:t xml:space="preserve">La Tabla 3 detalla la estadística descriptiva con n = 100 000. La variabilidad relativa fue apreciable: la desviación estándar fue de entre 2.8 % y 25.3 % de la media en inserción (79 % en entradas ascendentes, con tiempos de décimas de milisegundo) y de entre 3.3 % y 30.9 % en quicksort, </w:t>
+      </w:r>
+      <w:r>
+        <w:t>lo que se aprecia en la dispersión de la Figura 2. Por ello conviene leer la mediana junto con la media (Tabla 3).</w:t>
       </w:r>
     </w:p>
     <w:p>
@@ -2760,7 +2760,7 @@
                 <w:sz w:val="22"/>
                 <w:szCs w:val="22"/>
               </w:rPr>
-              <w:t>1 645.0</w:t>
+              <w:t>2 459.9</w:t>
             </w:r>
           </w:p>
         </w:tc>
@@ -2780,7 +2780,7 @@
                 <w:sz w:val="22"/>
                 <w:szCs w:val="22"/>
               </w:rPr>
-              <w:t>1 627.8</w:t>
+              <w:t>2 061.6</w:t>
             </w:r>
           </w:p>
         </w:tc>
@@ -2800,7 +2800,7 @@
                 <w:sz w:val="22"/>
                 <w:szCs w:val="22"/>
               </w:rPr>
-              <w:t>39.9</w:t>
+              <w:t>622.7</w:t>
             </w:r>
           </w:p>
         </w:tc>
@@ -2820,7 +2820,7 @@
                 <w:sz w:val="22"/>
                 <w:szCs w:val="22"/>
               </w:rPr>
-              <w:t>1 610.0</w:t>
+              <w:t>1 970.8</w:t>
             </w:r>
           </w:p>
         </w:tc>
@@ -2840,7 +2840,7 @@
                 <w:sz w:val="22"/>
                 <w:szCs w:val="22"/>
               </w:rPr>
-              <w:t>1 773.2</w:t>
+              <w:t>3 521.3</w:t>
             </w:r>
           </w:p>
         </w:tc>
@@ -2897,7 +2897,7 @@
                 <w:sz w:val="22"/>
                 <w:szCs w:val="22"/>
               </w:rPr>
-              <w:t>0.0858</w:t>
+              <w:t>0.141</w:t>
             </w:r>
           </w:p>
         </w:tc>
@@ -2917,7 +2917,7 @@
                 <w:sz w:val="22"/>
                 <w:szCs w:val="22"/>
               </w:rPr>
-              <w:t>0.0854</w:t>
+              <w:t>0.103</w:t>
             </w:r>
           </w:p>
         </w:tc>
@@ -2937,7 +2937,7 @@
                 <w:sz w:val="22"/>
                 <w:szCs w:val="22"/>
               </w:rPr>
-              <w:t>0.0020</w:t>
+              <w:t>0.112</w:t>
             </w:r>
           </w:p>
         </w:tc>
@@ -2957,7 +2957,7 @@
                 <w:sz w:val="22"/>
                 <w:szCs w:val="22"/>
               </w:rPr>
-              <w:t>0.0844</w:t>
+              <w:t>0.101</w:t>
             </w:r>
           </w:p>
         </w:tc>
@@ -2977,7 +2977,7 @@
                 <w:sz w:val="22"/>
                 <w:szCs w:val="22"/>
               </w:rPr>
-              <w:t>0.0957</w:t>
+              <w:t>0.701</w:t>
             </w:r>
           </w:p>
         </w:tc>
@@ -3034,7 +3034,7 @@
                 <w:sz w:val="22"/>
                 <w:szCs w:val="22"/>
               </w:rPr>
-              <w:t>3 335.4</w:t>
+              <w:t>4 104.0</w:t>
             </w:r>
           </w:p>
         </w:tc>
@@ -3054,7 +3054,7 @@
                 <w:sz w:val="22"/>
                 <w:szCs w:val="22"/>
               </w:rPr>
-              <w:t>3 359.2</w:t>
+              <w:t>4 036.1</w:t>
             </w:r>
           </w:p>
         </w:tc>
@@ -3074,7 +3074,7 @@
                 <w:sz w:val="22"/>
                 <w:szCs w:val="22"/>
               </w:rPr>
-              <w:t>63.0</w:t>
+              <w:t>213.9</w:t>
             </w:r>
           </w:p>
         </w:tc>
@@ -3094,7 +3094,7 @@
                 <w:sz w:val="22"/>
                 <w:szCs w:val="22"/>
               </w:rPr>
-              <w:t>3 246.0</w:t>
+              <w:t>3 984.6</w:t>
             </w:r>
           </w:p>
         </w:tc>
@@ -3114,7 +3114,7 @@
                 <w:sz w:val="22"/>
                 <w:szCs w:val="22"/>
               </w:rPr>
-              <w:t>3 446.0</w:t>
+              <w:t>5 132.0</w:t>
             </w:r>
           </w:p>
         </w:tc>
@@ -3171,7 +3171,7 @@
                 <w:sz w:val="22"/>
                 <w:szCs w:val="22"/>
               </w:rPr>
-              <w:t>108.6</w:t>
+              <w:t>127.8</w:t>
             </w:r>
           </w:p>
         </w:tc>
@@ -3191,7 +3191,7 @@
                 <w:sz w:val="22"/>
                 <w:szCs w:val="22"/>
               </w:rPr>
-              <w:t>106.6</w:t>
+              <w:t>128.2</w:t>
             </w:r>
           </w:p>
         </w:tc>
@@ -3211,7 +3211,7 @@
                 <w:sz w:val="22"/>
                 <w:szCs w:val="22"/>
               </w:rPr>
-              <w:t>5.95</w:t>
+              <w:t>3.56</w:t>
             </w:r>
           </w:p>
         </w:tc>
@@ -3231,7 +3231,7 @@
                 <w:sz w:val="22"/>
                 <w:szCs w:val="22"/>
               </w:rPr>
-              <w:t>100.8</w:t>
+              <w:t>122.1</w:t>
             </w:r>
           </w:p>
         </w:tc>
@@ -3251,7 +3251,7 @@
                 <w:sz w:val="22"/>
                 <w:szCs w:val="22"/>
               </w:rPr>
-              <w:t>127.1</w:t>
+              <w:t>135.6</w:t>
             </w:r>
           </w:p>
         </w:tc>
@@ -3308,7 +3308,7 @@
                 <w:sz w:val="22"/>
                 <w:szCs w:val="22"/>
               </w:rPr>
-              <w:t>1 573.4</w:t>
+              <w:t>2 212.9</w:t>
             </w:r>
           </w:p>
         </w:tc>
@@ -3328,7 +3328,7 @@
                 <w:sz w:val="22"/>
                 <w:szCs w:val="22"/>
               </w:rPr>
-              <w:t>1 561.6</w:t>
+              <w:t>1 863.2</w:t>
             </w:r>
           </w:p>
         </w:tc>
@@ -3348,7 +3348,7 @@
                 <w:sz w:val="22"/>
                 <w:szCs w:val="22"/>
               </w:rPr>
-              <w:t>46.1</w:t>
+              <w:t>550.0</w:t>
             </w:r>
           </w:p>
         </w:tc>
@@ -3368,7 +3368,7 @@
                 <w:sz w:val="22"/>
                 <w:szCs w:val="22"/>
               </w:rPr>
-              <w:t>1 514.2</w:t>
+              <w:t>1 841.0</w:t>
             </w:r>
           </w:p>
         </w:tc>
@@ -3388,7 +3388,7 @@
                 <w:sz w:val="22"/>
                 <w:szCs w:val="22"/>
               </w:rPr>
-              <w:t>1 759.2</w:t>
+              <w:t>3 155.0</w:t>
             </w:r>
           </w:p>
         </w:tc>
@@ -3452,7 +3452,7 @@
                 <w:sz w:val="22"/>
                 <w:szCs w:val="22"/>
               </w:rPr>
-              <w:t>4.29</w:t>
+              <w:t>6.19</w:t>
             </w:r>
           </w:p>
         </w:tc>
@@ -3472,7 +3472,7 @@
                 <w:sz w:val="22"/>
                 <w:szCs w:val="22"/>
               </w:rPr>
-              <w:t>4.28</w:t>
+              <w:t>5.21</w:t>
             </w:r>
           </w:p>
         </w:tc>
@@ -3492,7 +3492,7 @@
                 <w:sz w:val="22"/>
                 <w:szCs w:val="22"/>
               </w:rPr>
-              <w:t>0.0886</w:t>
+              <w:t>1.53</w:t>
             </w:r>
           </w:p>
         </w:tc>
@@ -3512,7 +3512,7 @@
                 <w:sz w:val="22"/>
                 <w:szCs w:val="22"/>
               </w:rPr>
-              <w:t>4.18</w:t>
+              <w:t>4.97</w:t>
             </w:r>
           </w:p>
         </w:tc>
@@ -3532,7 +3532,7 @@
                 <w:sz w:val="22"/>
                 <w:szCs w:val="22"/>
               </w:rPr>
-              <w:t>4.68</w:t>
+              <w:t>9.13</w:t>
             </w:r>
           </w:p>
         </w:tc>
@@ -3589,7 +3589,7 @@
                 <w:sz w:val="22"/>
                 <w:szCs w:val="22"/>
               </w:rPr>
-              <w:t>1.10</w:t>
+              <w:t>1.41</w:t>
             </w:r>
           </w:p>
         </w:tc>
@@ -3609,7 +3609,7 @@
                 <w:sz w:val="22"/>
                 <w:szCs w:val="22"/>
               </w:rPr>
-              <w:t>1.04</w:t>
+              <w:t>1.25</w:t>
             </w:r>
           </w:p>
         </w:tc>
@@ -3629,7 +3629,7 @@
                 <w:sz w:val="22"/>
                 <w:szCs w:val="22"/>
               </w:rPr>
-              <w:t>0.265</w:t>
+              <w:t>0.435</w:t>
             </w:r>
           </w:p>
         </w:tc>
@@ -3649,7 +3649,7 @@
                 <w:sz w:val="22"/>
                 <w:szCs w:val="22"/>
               </w:rPr>
-              <w:t>1.02</w:t>
+              <w:t>1.21</w:t>
             </w:r>
           </w:p>
         </w:tc>
@@ -3669,7 +3669,7 @@
                 <w:sz w:val="22"/>
                 <w:szCs w:val="22"/>
               </w:rPr>
-              <w:t>2.49</w:t>
+              <w:t>3.39</w:t>
             </w:r>
           </w:p>
         </w:tc>
@@ -3726,7 +3726,7 @@
                 <w:sz w:val="22"/>
                 <w:szCs w:val="22"/>
               </w:rPr>
-              <w:t>1.41</w:t>
+              <w:t>1.56</w:t>
             </w:r>
           </w:p>
         </w:tc>
@@ -3746,7 +3746,7 @@
                 <w:sz w:val="22"/>
                 <w:szCs w:val="22"/>
               </w:rPr>
-              <w:t>1.30</w:t>
+              <w:t>1.52</w:t>
             </w:r>
           </w:p>
         </w:tc>
@@ -3766,7 +3766,7 @@
                 <w:sz w:val="22"/>
                 <w:szCs w:val="22"/>
               </w:rPr>
-              <w:t>0.383</w:t>
+              <w:t>0.121</w:t>
             </w:r>
           </w:p>
         </w:tc>
@@ -3786,7 +3786,7 @@
                 <w:sz w:val="22"/>
                 <w:szCs w:val="22"/>
               </w:rPr>
-              <w:t>1.26</w:t>
+              <w:t>1.49</w:t>
             </w:r>
           </w:p>
         </w:tc>
@@ -3806,7 +3806,7 @@
                 <w:sz w:val="22"/>
                 <w:szCs w:val="22"/>
               </w:rPr>
-              <w:t>2.90</w:t>
+              <w:t>2.03</w:t>
             </w:r>
           </w:p>
         </w:tc>
@@ -3863,7 +3863,7 @@
                 <w:sz w:val="22"/>
                 <w:szCs w:val="22"/>
               </w:rPr>
-              <w:t>2.23</w:t>
+              <w:t>2.55</w:t>
             </w:r>
           </w:p>
         </w:tc>
@@ -3883,7 +3883,7 @@
                 <w:sz w:val="22"/>
                 <w:szCs w:val="22"/>
               </w:rPr>
-              <w:t>2.13</w:t>
+              <w:t>2.52</w:t>
             </w:r>
           </w:p>
         </w:tc>
@@ -3903,7 +3903,7 @@
                 <w:sz w:val="22"/>
                 <w:szCs w:val="22"/>
               </w:rPr>
-              <w:t>0.327</w:t>
+              <w:t>0.0840</w:t>
             </w:r>
           </w:p>
         </w:tc>
@@ -3923,7 +3923,7 @@
                 <w:sz w:val="22"/>
                 <w:szCs w:val="22"/>
               </w:rPr>
-              <w:t>2.10</w:t>
+              <w:t>2.47</w:t>
             </w:r>
           </w:p>
         </w:tc>
@@ -3943,7 +3943,7 @@
                 <w:sz w:val="22"/>
                 <w:szCs w:val="22"/>
               </w:rPr>
-              <w:t>3.68</w:t>
+              <w:t>2.81</w:t>
             </w:r>
           </w:p>
         </w:tc>
@@ -4009,7 +4009,7 @@
                 <w:sz w:val="22"/>
                 <w:szCs w:val="22"/>
               </w:rPr>
-              <w:t>220.9</w:t>
+              <w:t>319.1</w:t>
             </w:r>
           </w:p>
         </w:tc>
@@ -4032,7 +4032,7 @@
                 <w:sz w:val="22"/>
                 <w:szCs w:val="22"/>
               </w:rPr>
-              <w:t>219.6</w:t>
+              <w:t>268.7</w:t>
             </w:r>
           </w:p>
         </w:tc>
@@ -4055,7 +4055,7 @@
                 <w:sz w:val="22"/>
                 <w:szCs w:val="22"/>
               </w:rPr>
-              <w:t>7.01</w:t>
+              <w:t>83.2</w:t>
             </w:r>
           </w:p>
         </w:tc>
@@ -4078,7 +4078,7 @@
                 <w:sz w:val="22"/>
                 <w:szCs w:val="22"/>
               </w:rPr>
-              <w:t>214.5</w:t>
+              <w:t>259.7</w:t>
             </w:r>
           </w:p>
         </w:tc>
@@ -4101,7 +4101,7 @@
                 <w:sz w:val="22"/>
                 <w:szCs w:val="22"/>
               </w:rPr>
-              <w:t>250.9</w:t>
+              <w:t>489.4</w:t>
             </w:r>
           </w:p>
         </w:tc>
@@ -5446,7 +5446,7 @@
         <w:jc w:val="both"/>
       </w:pPr>
       <w:r>
-        <w:t>Las pendientes log-log del tiempo medio entre n = 1 000 y n = 100 000 fueron, en inserción, de 2.00 a 2.01 para los patrones aleatorio, descendente, casi ordenado y duplicados, y de 0.91 para el ascendente (valor algo subestimado, pues con n = 1 000 ese tiempo es de apenas 1.3 µs, cerca de la resolución del reloj). En quicksort fueron de 1.03 a 1.13 para los cuatro primeros patrones y de 1.89 para duplicados.</w:t>
+        <w:t>Las pendientes log-log del tiempo medio entre n = 1 000 y n = 100 000 fueron, en inserción, de 1.89 a 1.96 para los patrones aleatorio, descendente, casi ordenado y duplicados, y de 0.98 para el ascendente (con n = 1 000 ese tiempo es de apenas 1.6 µs, cerca de la resolución del reloj). En quicksort fueron de 1.00 a 1.03 para los cuatro primeros patrones y de 1.84 para duplicados.</w:t>
       </w:r>
     </w:p>
     <w:p>
@@ -5481,7 +5481,7 @@
         <w:t>H1 (crecimiento cuadrático frente a n log n).</w:t>
       </w:r>
       <w:r>
-        <w:t xml:space="preserve"> Se cumplió en general. Las pendientes de inserción cercanas a 2 confirman el comportamiento cuadrático salvo en entradas ascendentes (0.91, aproximadamente lineal, con n − 1 comparaciones). Las de quicksort, entre 1.03 y 1.13, se acercan al valor teórico de n log n en este rango (1.11). La excepción fue quicksort con duplicados (1.89): con solo 15 valores distintos y la condición ≤, cada tramo de claves iguales se parte de forma totalmente desbalanceada, y el costo se vuelve cuadrático dentro de cada grupo. Esto explica que la profundidad (≈ 6 807) sea cercana a n/15 ≈ 6 667 y que las comparaciones (333.8 millones) se aproximen a n²/30 ≈ 333 millones.</w:t>
+        <w:t xml:space="preserve"> Se cumplió en general. Las pendientes de inserción cercanas a 2 confirman el comportamiento cuadrático salvo en entradas ascendentes (0.98, aproximadamente lineal, con n − 1 comparaciones). Las de quicksort, entre 1.00 y 1.03, quedan algo por debajo del valor teórico de n log n en este rango (1.11); la diferencia probablemente se debe a los costos fijos y al ruido de medición con n = 1 000, donde cada ejecución dura décimas de milisegundo. La excepción fue quicksort con duplicados (1.84): con solo 15 valores distintos y la condición ≤, cada tramo de claves iguales se parte de forma totalmente desbalanceada, y el costo se vuelve cuadrático dentro de cada grupo. Esto explica que la profundidad (≈ 6 807) sea cercana a n/15 ≈ 6 667 y que las comparaciones (333.8 millones) se aproximen a n²/30 ≈ 333 millones.</w:t>
       </w:r>
     </w:p>
     <w:p>
@@ -5497,7 +5497,7 @@
         <w:t>H2 (inserción en entradas ascendentes y casi ordenadas).</w:t>
       </w:r>
       <w:r>
-        <w:t xml:space="preserve"> Se cumplió de forma parcial. En entradas ascendentes inserción fue 13 veces más rápida que quicksort con n = 100 000, porque solo compara cada elemento con su vecino. En entradas casi ordenadas (5 % permutado) solo fue competitiva con n pequeño: con n = 1 000 ambos tardaron prácticamente lo mismo (0.0111 ms frente a 0.0125 ms), pero con n = 100 000 inserción fue 49 veces más lenta. La razón es que cada elemento permutado queda lejos de su posición y aporta del orden de n/3 inversiones, de modo que el costo sigue siendo cuadrático (pendiente 2.00), solo con una constante menor. Este resultado depende del porcentaje de desorden elegido.</w:t>
+        <w:t xml:space="preserve"> Se cumplió de forma parcial. En entradas ascendentes inserción fue 10 veces más rápida que quicksort con n = 100 000, porque solo compara cada elemento con su vecino. En entradas casi ordenadas (5 % permutado) solo fue competitiva con n pequeño: con n = 1 000 ambos tardaron prácticamente lo mismo (0.0213 ms frente a 0.0233 ms), pero con n = 100 000 inserción fue 50 veces más lenta. La razón es que cada elemento permutado queda lejos de su posición y aporta del orden de n/3 inversiones, de modo que el costo sigue siendo cuadrático (pendiente 1.89), solo con una constante menor. Este resultado depende del porcentaje de desorden elegido.</w:t>
       </w:r>
     </w:p>
     <w:p>
@@ -5530,7 +5530,7 @@
         <w:t>Recursión y memoria.</w:t>
       </w:r>
       <w:r>
-        <w:t xml:space="preserve"> Inserción usa memoria auxiliar constante. Quicksort necesita pila: con datos aleatorios la profundidad fue de unos 40 niveles (del orden de log n), pero con duplicados llegó a más de 6 800, lo que muestra que el uso de pila en el peor caso es proporcional a n. Una variante que recurra primero sobre el tramo menor, o una partición de tres vías, acotaría ese riesgo. Aun así, con duplicados quicksort (220.9 ms) fue más rápido que inserción (1 573 ms), aunque 52 veces más lento que consigo mismo en datos aleatorios.</w:t>
+        <w:t xml:space="preserve"> Inserción usa memoria auxiliar constante. Quicksort necesita pila: con datos aleatorios la profundidad fue de unos 40 niveles (del orden de log n), pero con duplicados llegó a más de 6 800, lo que muestra que el uso de pila en el peor caso es proporcional a n. Una variante que recurra primero sobre el tramo menor, o una partición de tres vías, acotaría ese riesgo. Aun así, con duplicados quicksort (319.1 ms) fue más rápido que inserción (2 213 ms), aunque 52 veces más lento que consigo mismo en datos aleatorios.</w:t>
       </w:r>
     </w:p>
     <w:p>
@@ -5546,7 +5546,7 @@
         <w:t>Limitaciones y amenazas a la validez.</w:t>
       </w:r>
       <w:r>
-        <w:t xml:space="preserve"> (a) Todos los datos provienen de un solo equipo (una laptop con Windows 11, conectada a la corriente, con procesador de frecuencia variable) y de una sola corrida, por lo que el tiempo absoluto puede variar en otro hardware o con carga distinta del sistema; las conclusiones sobre el orden de crecimiento y las razones entre algoritmos son más robustas que los milisegundos. (b) Los contadores forman parte del código medido. (c) Solo se probaron tres tamaños, de modo que las pendientes son estimaciones gruesas. (d) Los tiempos menores a unos pocos microsegundos (inserción en entradas ascendentes con n = 1 000) están cerca de la resolución del reloj. (e) Los resultados dependen de las variantes elegidas (pivote central, condición ≤, enteros de 32 bits) y del porcentaje de desorden y de valores únicos definidos; con otro pivote o con partición de tres vías el comportamiento con duplicados sería distinto. (f) El análisis es descriptivo y no permite inferir significancia estadística.</w:t>
+        <w:t xml:space="preserve"> (a) Todos los datos provienen de un solo equipo (una laptop con Windows 11, conectada a la corriente, con procesador de frecuencia variable) y de una sola corrida, por lo que el tiempo absoluto puede variar en otro hardware o con carga distinta del sistema; las conclusiones sobre el orden de crecimiento y las razones entre algoritmos son más robustas que los milisegundos. Además, la dispersión entre repeticiones es considerable (hasta cerca de 25 % de la media en inserción con datos aleatorios), lo que es típico de una laptop con frecuencia y planificador variables; por eso se reporta también la mediana. (b) Los contadores forman parte del código medido. (c) Solo se probaron tres tamaños, de modo que las pendientes son estimaciones gruesas. (d) Los tiempos menores a unos pocos microsegundos (inserción en entradas ascendentes con n = 1 000) están cerca de la resolución del reloj. (e) Los resultados dependen de las variantes elegidas (pivote central, condición ≤, enteros de 32 bits) y del porcentaje de desorden y de valores únicos definidos; con otro pivote o con partición de tres vías el comportamiento con duplicados sería distinto. (f) El análisis es descriptivo y no permite inferir significancia estadística.</w:t>
       </w:r>
     </w:p>
     <w:p>
@@ -5574,7 +5574,7 @@
         <w:jc w:val="both"/>
       </w:pPr>
       <w:r>
-        <w:t>2. Con 100 000 enteros aleatorios quicksort fue unas 384 veces más rápido que inserción (4.29 ms frente a 1 645 ms).</w:t>
+        <w:t>2. Con 100 000 enteros aleatorios quicksort fue unas 397 veces más rápido que inserción (6.19 ms frente a 2 460 ms).</w:t>
       </w:r>
     </w:p>
     <w:p>
@@ -5583,7 +5583,7 @@
         <w:jc w:val="both"/>
       </w:pPr>
       <w:r>
-        <w:t>3. Inserción solo superó a quicksort en entradas ascendentes (13 veces más rápida) y se igualó a él en entradas casi ordenadas únicamente con n = 1 000.</w:t>
+        <w:t>3. Inserción solo superó a quicksort en entradas ascendentes (10 veces más rápida) y se igualó a él en entradas casi ordenadas únicamente con n = 1 000.</w:t>
       </w:r>
     </w:p>
     <w:p>

</xml_diff>